<commit_message>
Add updated report and railroad diagram
</commit_message>
<xml_diff>
--- a/Отчёт_мини_компилятор_вариант_5.docx
+++ b/Отчёт_мини_компилятор_вариант_5.docx
@@ -190,6 +190,7 @@
           <w:rFonts w:cs="Times New Roman"/>
           <w:sz w:val="28"/>
           <w:szCs w:val="28"/>
+          <w:lang w:val="ru-RU"/>
         </w:rPr>
       </w:pPr>
     </w:p>
@@ -371,7 +372,12 @@
     <w:sdt>
       <w:sdtPr>
         <w:rPr>
-          <w:rFonts w:ascii="Times New Roman" w:hAnsi="Times New Roman" w:cs="Times New Roman"/>
+          <w:rFonts w:ascii="Times New Roman" w:eastAsia="Times New Roman" w:hAnsi="Times New Roman" w:cs="Times New Roman"/>
+          <w:b w:val="0"/>
+          <w:bCs w:val="0"/>
+          <w:color w:val="auto"/>
+          <w:sz w:val="24"/>
+          <w:szCs w:val="22"/>
           <w:lang w:val="ru-RU"/>
         </w:rPr>
         <w:id w:val="463003589"/>
@@ -382,8 +388,6 @@
       </w:sdtPr>
       <w:sdtEndPr>
         <w:rPr>
-          <w:rFonts w:eastAsia="Times New Roman"/>
-          <w:color w:val="auto"/>
           <w:lang w:val="en-US"/>
         </w:rPr>
       </w:sdtEndPr>
@@ -3043,6 +3047,7 @@
           <w:rFonts w:cs="Times New Roman"/>
           <w:sz w:val="28"/>
           <w:szCs w:val="28"/>
+          <w:lang w:val="ru-RU"/>
         </w:rPr>
       </w:pPr>
       <w:r>
@@ -3081,6 +3086,7 @@
           <w:rFonts w:cs="Times New Roman"/>
           <w:sz w:val="28"/>
           <w:szCs w:val="28"/>
+          <w:lang w:val="ru-RU"/>
         </w:rPr>
       </w:pPr>
     </w:p>
@@ -3887,14 +3893,17 @@
             </w:pPr>
             <w:r>
               <w:rPr>
-                <w:noProof/>
+                <w:rFonts w:cs="Times New Roman"/>
+                <w:sz w:val="28"/>
+                <w:szCs w:val="28"/>
+                <w:lang w:val="ru-RU"/>
               </w:rPr>
               <w:lastRenderedPageBreak/>
               <w:drawing>
-                <wp:inline distT="0" distB="0" distL="0" distR="0" wp14:anchorId="37639554" wp14:editId="0264897E">
-                  <wp:extent cx="5934075" cy="4197985"/>
-                  <wp:effectExtent l="0" t="0" r="0" b="0"/>
-                  <wp:docPr id="1" name="Рисунок 19"/>
+                <wp:inline distT="0" distB="0" distL="0" distR="0" wp14:anchorId="2F59DD77" wp14:editId="56D6CECC">
+                  <wp:extent cx="6152515" cy="4051300"/>
+                  <wp:effectExtent l="0" t="0" r="635" b="6350"/>
+                  <wp:docPr id="967751905" name="Рисунок 2"/>
                   <wp:cNvGraphicFramePr>
                     <a:graphicFrameLocks xmlns:a="http://schemas.openxmlformats.org/drawingml/2006/main" noChangeAspect="1"/>
                   </wp:cNvGraphicFramePr>
@@ -3902,13 +3911,20 @@
                     <a:graphicData uri="http://schemas.openxmlformats.org/drawingml/2006/picture">
                       <pic:pic xmlns:pic="http://schemas.openxmlformats.org/drawingml/2006/picture">
                         <pic:nvPicPr>
-                          <pic:cNvPr id="1" name="Рисунок 19"/>
+                          <pic:cNvPr id="0" name="Picture 6"/>
                           <pic:cNvPicPr>
                             <a:picLocks noChangeAspect="1" noChangeArrowheads="1"/>
                           </pic:cNvPicPr>
                         </pic:nvPicPr>
                         <pic:blipFill>
-                          <a:blip r:embed="rId8"/>
+                          <a:blip r:embed="rId8">
+                            <a:extLst>
+                              <a:ext uri="{28A0092B-C50C-407E-A947-70E740481C1C}">
+                                <a14:useLocalDpi xmlns:a14="http://schemas.microsoft.com/office/drawing/2010/main" val="0"/>
+                              </a:ext>
+                            </a:extLst>
+                          </a:blip>
+                          <a:srcRect/>
                           <a:stretch>
                             <a:fillRect/>
                           </a:stretch>
@@ -3916,12 +3932,15 @@
                         <pic:spPr bwMode="auto">
                           <a:xfrm>
                             <a:off x="0" y="0"/>
-                            <a:ext cx="5934075" cy="4197985"/>
+                            <a:ext cx="6152515" cy="4051300"/>
                           </a:xfrm>
                           <a:prstGeom prst="rect">
                             <a:avLst/>
                           </a:prstGeom>
                           <a:noFill/>
+                          <a:ln>
+                            <a:noFill/>
+                          </a:ln>
                         </pic:spPr>
                       </pic:pic>
                     </a:graphicData>
@@ -3930,6 +3949,17 @@
               </w:drawing>
             </w:r>
           </w:p>
+          <w:p>
+            <w:pPr>
+              <w:spacing w:line="360" w:lineRule="auto"/>
+              <w:rPr>
+                <w:rFonts w:cs="Times New Roman"/>
+                <w:sz w:val="28"/>
+                <w:szCs w:val="28"/>
+                <w:lang w:val="ru-RU"/>
+              </w:rPr>
+            </w:pPr>
+          </w:p>
         </w:tc>
       </w:tr>
     </w:tbl>
@@ -4047,7 +4077,17 @@
           <w:szCs w:val="28"/>
           <w:lang w:val="ru-RU"/>
         </w:rPr>
-        <w:t>, задаёт грамматику учебного языка с C-</w:t>
+        <w:t xml:space="preserve">, </w:t>
+      </w:r>
+      <w:r>
+        <w:rPr>
+          <w:rFonts w:cs="Times New Roman"/>
+          <w:sz w:val="28"/>
+          <w:szCs w:val="28"/>
+          <w:lang w:val="ru-RU"/>
+        </w:rPr>
+        <w:lastRenderedPageBreak/>
+        <w:t>задаёт грамматику учебного языка с C-</w:t>
       </w:r>
       <w:proofErr w:type="spellStart"/>
       <w:r>
@@ -4067,17 +4107,7 @@
           <w:szCs w:val="28"/>
           <w:lang w:val="ru-RU"/>
         </w:rPr>
-        <w:t xml:space="preserve"> синтаксисом и строит абстрактное </w:t>
-      </w:r>
-      <w:r>
-        <w:rPr>
-          <w:rFonts w:cs="Times New Roman"/>
-          <w:sz w:val="28"/>
-          <w:szCs w:val="28"/>
-          <w:lang w:val="ru-RU"/>
-        </w:rPr>
-        <w:lastRenderedPageBreak/>
-        <w:t>синтаксическое дерево. Именно на этом этапе фиксируются правила разбора функций, блоков, условных операторов </w:t>
+        <w:t xml:space="preserve"> синтаксисом и строит абстрактное синтаксическое дерево. Именно на этом этапе фиксируются правила разбора функций, блоков, условных операторов </w:t>
       </w:r>
       <w:proofErr w:type="spellStart"/>
       <w:r>
@@ -5344,6 +5374,7 @@
           <w:szCs w:val="28"/>
           <w:lang w:val="ru-RU"/>
         </w:rPr>
+        <w:lastRenderedPageBreak/>
         <w:t>3. в одной области видимости запрещено повторное объявление переменной;</w:t>
       </w:r>
     </w:p>
@@ -5365,7 +5396,6 @@
           <w:szCs w:val="28"/>
           <w:lang w:val="ru-RU"/>
         </w:rPr>
-        <w:lastRenderedPageBreak/>
         <w:t>4. использование необъявленного имени считается ошибкой;</w:t>
       </w:r>
     </w:p>
@@ -5650,16 +5680,7 @@
           <w:szCs w:val="28"/>
           <w:lang w:val="ru-RU"/>
         </w:rPr>
-        <w:t xml:space="preserve">. </w:t>
-      </w:r>
-      <w:r>
-        <w:rPr>
-          <w:rFonts w:cs="Times New Roman"/>
-          <w:sz w:val="28"/>
-          <w:szCs w:val="28"/>
-          <w:lang w:val="ru-RU"/>
-        </w:rPr>
-        <w:t>Этот пример показывает, что семантический анализатор проверяет глобальную структуру всей программы, а не только локальные типы.</w:t>
+        <w:t>. Этот пример показывает, что семантический анализатор проверяет глобальную структуру всей программы, а не только локальные типы.</w:t>
       </w:r>
     </w:p>
     <w:p>
@@ -5849,6 +5870,7 @@
           <w:szCs w:val="28"/>
           <w:lang w:val="ru-RU"/>
         </w:rPr>
+        <w:lastRenderedPageBreak/>
         <w:t>compiled_</w:t>
       </w:r>
       <w:proofErr w:type="gramStart"/>
@@ -5990,17 +6012,7 @@
           <w:szCs w:val="28"/>
           <w:lang w:val="ru-RU"/>
         </w:rPr>
-        <w:t xml:space="preserve">, которые должны иметь логический результат, корректности типов в </w:t>
-      </w:r>
-      <w:r>
-        <w:rPr>
-          <w:rFonts w:cs="Times New Roman"/>
-          <w:sz w:val="28"/>
-          <w:szCs w:val="28"/>
-          <w:lang w:val="ru-RU"/>
-        </w:rPr>
-        <w:lastRenderedPageBreak/>
-        <w:t xml:space="preserve">арифметических, сравнительных и логических операциях, а также согласованности типов в операторах </w:t>
+        <w:t xml:space="preserve">, которые должны иметь логический результат, корректности типов в арифметических, сравнительных и логических операциях, а также согласованности типов в операторах </w:t>
       </w:r>
       <w:proofErr w:type="spellStart"/>
       <w:r>
@@ -7797,6 +7809,7 @@
       <w:r>
         <w:rPr>
           <w:rFonts w:cs="Times New Roman"/>
+          <w:noProof/>
           <w:sz w:val="28"/>
           <w:szCs w:val="28"/>
           <w:lang w:val="ru-RU"/>
@@ -7927,6 +7940,7 @@
       <w:r>
         <w:rPr>
           <w:rFonts w:cs="Times New Roman"/>
+          <w:noProof/>
           <w:sz w:val="28"/>
           <w:szCs w:val="28"/>
           <w:lang w:val="ru-RU"/>
@@ -9437,6 +9451,7 @@
             <w:r>
               <w:rPr>
                 <w:rFonts w:cs="Times New Roman"/>
+                <w:noProof/>
                 <w:sz w:val="28"/>
                 <w:szCs w:val="28"/>
               </w:rPr>
@@ -9834,6 +9849,7 @@
             <w:r>
               <w:rPr>
                 <w:rFonts w:cs="Times New Roman"/>
+                <w:noProof/>
                 <w:sz w:val="28"/>
                 <w:szCs w:val="28"/>
               </w:rPr>
@@ -10277,6 +10293,7 @@
             <w:r>
               <w:rPr>
                 <w:rFonts w:cs="Times New Roman"/>
+                <w:noProof/>
                 <w:sz w:val="28"/>
                 <w:szCs w:val="28"/>
               </w:rPr>
@@ -11512,6 +11529,7 @@
             <w:r>
               <w:rPr>
                 <w:rFonts w:cs="Times New Roman"/>
+                <w:noProof/>
                 <w:sz w:val="28"/>
                 <w:szCs w:val="28"/>
                 <w:lang w:val="ru-RU"/>
@@ -11631,6 +11649,7 @@
           <w:bCs/>
           <w:sz w:val="28"/>
           <w:szCs w:val="28"/>
+          <w:lang w:val="ru-RU"/>
         </w:rPr>
       </w:pPr>
     </w:p>
@@ -11894,6 +11913,7 @@
             <w:r>
               <w:rPr>
                 <w:rFonts w:cs="Times New Roman"/>
+                <w:noProof/>
                 <w:sz w:val="28"/>
                 <w:szCs w:val="28"/>
                 <w:lang w:val="ru-RU"/>
@@ -11954,6 +11974,7 @@
                 <w:rFonts w:cs="Times New Roman"/>
                 <w:sz w:val="28"/>
                 <w:szCs w:val="28"/>
+                <w:lang w:val="ru-RU"/>
               </w:rPr>
             </w:pPr>
             <w:r>
@@ -11996,6 +12017,7 @@
           <w:rFonts w:cs="Times New Roman"/>
           <w:sz w:val="28"/>
           <w:szCs w:val="28"/>
+          <w:lang w:val="ru-RU"/>
         </w:rPr>
       </w:pPr>
     </w:p>
@@ -12411,6 +12433,7 @@
       <w:r>
         <w:rPr>
           <w:rFonts w:cs="Times New Roman"/>
+          <w:noProof/>
           <w:sz w:val="28"/>
           <w:szCs w:val="28"/>
         </w:rPr>
@@ -12945,7 +12968,6 @@
           <w:rFonts w:eastAsia="Courier New" w:cs="Times New Roman"/>
           <w:sz w:val="28"/>
           <w:szCs w:val="28"/>
-          <w:lang w:val="ru-RU"/>
         </w:rPr>
       </w:pPr>
       <w:proofErr w:type="gramStart"/>
@@ -13027,6 +13049,7 @@
       <w:r>
         <w:rPr>
           <w:rFonts w:cs="Times New Roman"/>
+          <w:noProof/>
           <w:sz w:val="28"/>
           <w:szCs w:val="28"/>
           <w:lang w:val="ru-RU"/>
@@ -13213,16 +13236,79 @@
           <w:rFonts w:eastAsia="Courier New" w:cs="Times New Roman"/>
           <w:sz w:val="28"/>
           <w:szCs w:val="28"/>
-          <w:lang w:val="ru-RU"/>
         </w:rPr>
       </w:pPr>
+      <w:proofErr w:type="spellStart"/>
       <w:r>
         <w:rPr>
           <w:rFonts w:eastAsia="Courier New" w:cs="Times New Roman"/>
           <w:sz w:val="28"/>
           <w:szCs w:val="28"/>
         </w:rPr>
-        <w:t>mipsel-linux-gnu-gcc runtime/main.c build/05_do_while_</w:t>
+        <w:t>mipsel</w:t>
+      </w:r>
+      <w:proofErr w:type="spellEnd"/>
+      <w:r>
+        <w:rPr>
+          <w:rFonts w:eastAsia="Courier New" w:cs="Times New Roman"/>
+          <w:sz w:val="28"/>
+          <w:szCs w:val="28"/>
+        </w:rPr>
+        <w:t>-</w:t>
+      </w:r>
+      <w:proofErr w:type="spellStart"/>
+      <w:r>
+        <w:rPr>
+          <w:rFonts w:eastAsia="Courier New" w:cs="Times New Roman"/>
+          <w:sz w:val="28"/>
+          <w:szCs w:val="28"/>
+        </w:rPr>
+        <w:t>linux</w:t>
+      </w:r>
+      <w:proofErr w:type="spellEnd"/>
+      <w:r>
+        <w:rPr>
+          <w:rFonts w:eastAsia="Courier New" w:cs="Times New Roman"/>
+          <w:sz w:val="28"/>
+          <w:szCs w:val="28"/>
+        </w:rPr>
+        <w:t>-gnu-</w:t>
+      </w:r>
+      <w:proofErr w:type="spellStart"/>
+      <w:r>
+        <w:rPr>
+          <w:rFonts w:eastAsia="Courier New" w:cs="Times New Roman"/>
+          <w:sz w:val="28"/>
+          <w:szCs w:val="28"/>
+        </w:rPr>
+        <w:t>gcc</w:t>
+      </w:r>
+      <w:proofErr w:type="spellEnd"/>
+      <w:r>
+        <w:rPr>
+          <w:rFonts w:eastAsia="Courier New" w:cs="Times New Roman"/>
+          <w:sz w:val="28"/>
+          <w:szCs w:val="28"/>
+        </w:rPr>
+        <w:t xml:space="preserve"> runtime/</w:t>
+      </w:r>
+      <w:proofErr w:type="spellStart"/>
+      <w:r>
+        <w:rPr>
+          <w:rFonts w:eastAsia="Courier New" w:cs="Times New Roman"/>
+          <w:sz w:val="28"/>
+          <w:szCs w:val="28"/>
+        </w:rPr>
+        <w:t>main.c</w:t>
+      </w:r>
+      <w:proofErr w:type="spellEnd"/>
+      <w:r>
+        <w:rPr>
+          <w:rFonts w:eastAsia="Courier New" w:cs="Times New Roman"/>
+          <w:sz w:val="28"/>
+          <w:szCs w:val="28"/>
+        </w:rPr>
+        <w:t xml:space="preserve"> build/05_do_while_</w:t>
       </w:r>
       <w:proofErr w:type="gramStart"/>
       <w:r>
@@ -13337,6 +13423,7 @@
       <w:r>
         <w:rPr>
           <w:rFonts w:cs="Times New Roman"/>
+          <w:noProof/>
           <w:sz w:val="28"/>
           <w:szCs w:val="28"/>
           <w:lang w:val="ru-RU"/>
@@ -13947,6 +14034,7 @@
             <w:r>
               <w:rPr>
                 <w:rFonts w:cs="Times New Roman"/>
+                <w:noProof/>
                 <w:sz w:val="28"/>
                 <w:szCs w:val="28"/>
               </w:rPr>
@@ -14103,6 +14191,7 @@
       <w:r>
         <w:rPr>
           <w:rFonts w:cs="Times New Roman"/>
+          <w:noProof/>
           <w:sz w:val="28"/>
           <w:szCs w:val="28"/>
           <w:lang w:val="ru-RU"/>

</xml_diff>